<commit_message>
Actualiza Guia Fase 2: persistencia Postgres al dia, modulo de Tickets y ajustes de formato
</commit_message>
<xml_diff>
--- a/docs/FASE 2/EVIDENCIAS GRUPALES/2.4_GuiaEstudiante_Fase 2_DesarrolloProyecto APT.docx
+++ b/docs/FASE 2/EVIDENCIAS GRUPALES/2.4_GuiaEstudiante_Fase 2_DesarrolloProyecto APT.docx
@@ -444,9 +444,6 @@
         <w:gridCol w:w="9639"/>
       </w:tblGrid>
       <w:tr>
-        <w:trPr>
-          <w:trHeight w:val="440"/>
-        </w:trPr>
         <w:tc>
           <w:tcPr>
             <w:tcW w:w="9639" w:type="dxa"/>
@@ -510,9 +507,6 @@
         </w:tc>
       </w:tr>
       <w:tr>
-        <w:trPr>
-          <w:trHeight w:val="800"/>
-        </w:trPr>
         <w:tc>
           <w:tcPr>
             <w:tcW w:w="9639" w:type="dxa"/>
@@ -638,7 +632,21 @@
               <w:rPr>
                 <w:rFonts w:ascii="Calibri" w:hAnsi="Calibri"/>
               </w:rPr>
-              <w:t xml:space="preserve">modelos predictivos de demanda (utilizando scikit-learn) </w:t>
+              <w:t xml:space="preserve">modelos predictivos de demanda (utilizando </w:t>
+            </w:r>
+            <w:proofErr w:type="spellStart"/>
+            <w:r>
+              <w:rPr>
+                <w:rFonts w:ascii="Calibri" w:hAnsi="Calibri"/>
+              </w:rPr>
+              <w:t>scikit-learn</w:t>
+            </w:r>
+            <w:proofErr w:type="spellEnd"/>
+            <w:r>
+              <w:rPr>
+                <w:rFonts w:ascii="Calibri" w:hAnsi="Calibri"/>
+              </w:rPr>
+              <w:t xml:space="preserve">) </w:t>
             </w:r>
             <w:r>
               <w:rPr>
@@ -688,15 +696,40 @@
               <w:rPr>
                 <w:rFonts w:ascii="Calibri" w:hAnsi="Calibri"/>
               </w:rPr>
-              <w:t>En el frontend, se construyó la interfaz operativa en React 18 (TypeScript) con Vite, maquetada con un tema claro institucional y conectada a mapas interactivos con Leaflet / OpenStreetMap. Se integró el motor de ruteo OSRM (Open Source Routing Machine) para el cálculo de distancias reales por calles y tiempos estimados de llegada (ETA). Asimismo, se logró la sincronización en tiempo real del estado de unidades y emergencias mediante los endpoints de estado compartido (/state), permitiendo la simulación de transiciones de códigos radiales (6-0 a 6-9).</w:t>
+              <w:t xml:space="preserve">En el frontend, se construyó la interfaz operativa en React 18 (TypeScript) con Vite, maquetada con un tema claro institucional y conectada a mapas interactivos con Leaflet / OpenStreetMap. Se integró el motor de ruteo OSRM (Open </w:t>
+            </w:r>
+            <w:proofErr w:type="spellStart"/>
+            <w:r>
+              <w:rPr>
+                <w:rFonts w:ascii="Calibri" w:hAnsi="Calibri"/>
+              </w:rPr>
+              <w:t>Source</w:t>
+            </w:r>
+            <w:proofErr w:type="spellEnd"/>
+            <w:r>
+              <w:rPr>
+                <w:rFonts w:ascii="Calibri" w:hAnsi="Calibri"/>
+              </w:rPr>
+              <w:t xml:space="preserve"> </w:t>
+            </w:r>
+            <w:proofErr w:type="spellStart"/>
+            <w:r>
+              <w:rPr>
+                <w:rFonts w:ascii="Calibri" w:hAnsi="Calibri"/>
+              </w:rPr>
+              <w:t>Routing</w:t>
+            </w:r>
+            <w:proofErr w:type="spellEnd"/>
+            <w:r>
+              <w:rPr>
+                <w:rFonts w:ascii="Calibri" w:hAnsi="Calibri"/>
+              </w:rPr>
+              <w:t xml:space="preserve"> Machine) para el cálculo de distancias reales por calles y tiempos estimados de llegada (ETA). El módulo de Emergencia y Operación (emergencias y asignaciones) ya persiste en una base de datos PostgreSQL 16 real, mediante SQLAlchemy y migraciones con Alembic, permitiendo registrar transiciones de códigos radiales (6-0 a 6-9) sobre datos reales en vez de un estado solo en memoria. Además, se incorporó un nuevo módulo de Tickets de Soporte para el seguimiento de incidencias reportadas por los usuarios.</w:t>
             </w:r>
           </w:p>
         </w:tc>
       </w:tr>
       <w:tr>
-        <w:trPr>
-          <w:trHeight w:val="1247"/>
-        </w:trPr>
         <w:tc>
           <w:tcPr>
             <w:tcW w:w="2670" w:type="dxa"/>
@@ -930,9 +963,6 @@
         </w:tc>
       </w:tr>
       <w:tr>
-        <w:trPr>
-          <w:trHeight w:val="939"/>
-        </w:trPr>
         <w:tc>
           <w:tcPr>
             <w:tcW w:w="2670" w:type="dxa"/>
@@ -996,7 +1026,21 @@
               <w:rPr>
                 <w:rFonts w:ascii="Calibri" w:hAnsi="Calibri"/>
               </w:rPr>
-              <w:t>El trabajo se organizará mediante un Product Backlog, en el cual se registrarán y priorizarán las funcionalidades, requisitos y tareas necesarias para el desarrollo de la plataforma. A partir de este listado, el equipo seleccionará las actividades que serán desarrolladas durante cada Sprint, definiendo objetivos concretos y resultados esperados.</w:t>
+              <w:t xml:space="preserve">El trabajo se organizará mediante un </w:t>
+            </w:r>
+            <w:proofErr w:type="spellStart"/>
+            <w:r>
+              <w:rPr>
+                <w:rFonts w:ascii="Calibri" w:hAnsi="Calibri"/>
+              </w:rPr>
+              <w:t>Product</w:t>
+            </w:r>
+            <w:proofErr w:type="spellEnd"/>
+            <w:r>
+              <w:rPr>
+                <w:rFonts w:ascii="Calibri" w:hAnsi="Calibri"/>
+              </w:rPr>
+              <w:t xml:space="preserve"> Backlog, en el cual se registrarán y priorizarán las funcionalidades, requisitos y tareas necesarias para el desarrollo de la plataforma. A partir de este listado, el equipo seleccionará las actividades que serán desarrolladas durante cada Sprint, definiendo objetivos concretos y resultados esperados.</w:t>
             </w:r>
           </w:p>
           <w:p>
@@ -1022,9 +1066,6 @@
         </w:tc>
       </w:tr>
       <w:tr>
-        <w:trPr>
-          <w:trHeight w:val="2377"/>
-        </w:trPr>
         <w:tc>
           <w:tcPr>
             <w:tcW w:w="2670" w:type="dxa"/>
@@ -1106,7 +1147,35 @@
               <w:rPr>
                 <w:rFonts w:ascii="Calibri" w:hAnsi="Calibri"/>
               </w:rPr>
-              <w:t xml:space="preserve">Modelos Predictivos y Algoritmo de Recomendación: Código fuente de los modelos predictivos en scikit-learn, módulo de evaluación de métricas (evaluate_model.py obteniendo </w:t>
+              <w:t xml:space="preserve">Modelos Predictivos y Algoritmo de Recomendación: Código fuente de los modelos predictivos en </w:t>
+            </w:r>
+            <w:proofErr w:type="spellStart"/>
+            <w:r>
+              <w:rPr>
+                <w:rFonts w:ascii="Calibri" w:hAnsi="Calibri"/>
+              </w:rPr>
+              <w:t>scikit-learn</w:t>
+            </w:r>
+            <w:proofErr w:type="spellEnd"/>
+            <w:r>
+              <w:rPr>
+                <w:rFonts w:ascii="Calibri" w:hAnsi="Calibri"/>
+              </w:rPr>
+              <w:t xml:space="preserve">, módulo de evaluación de métricas (evaluate_model.py obteniendo R2 y RMSE) y la implementación de la fórmula geodésica </w:t>
+            </w:r>
+            <w:proofErr w:type="spellStart"/>
+            <w:r>
+              <w:rPr>
+                <w:rFonts w:ascii="Calibri" w:hAnsi="Calibri"/>
+              </w:rPr>
+              <w:t>Haversine</w:t>
+            </w:r>
+            <w:proofErr w:type="spellEnd"/>
+            <w:r>
+              <w:rPr>
+                <w:rFonts w:ascii="Calibri" w:hAnsi="Calibri"/>
+              </w:rPr>
+              <w:t xml:space="preserve"> con ajuste de velocidad por tipo de terreno (35 km/h urbano y 50 km/h forestal) para la recomendación multicriterio de despacho.</w:t>
             </w:r>
             <m:oMath>
               <m:sSup>
@@ -1141,20 +1210,6 @@
                 </m:sup>
               </m:sSup>
             </m:oMath>
-            <w:r>
-              <w:rPr>
-                <w:rFonts w:ascii="Calibri" w:hAnsi="Calibri"/>
-              </w:rPr>
-              <w:t xml:space="preserve"> y RMSE) y la implementación de la fórmula geodésica Haversine con ajuste de velocidad por tipo de terreno (35 km/h urbano y 50 km/h forestal) para la recomendación multicriterio de despacho.</w:t>
-            </w:r>
-          </w:p>
-          <w:p>
-            <w:pPr>
-              <w:pStyle w:val="Prrafodelista"/>
-              <w:rPr>
-                <w:rFonts w:ascii="Calibri" w:hAnsi="Calibri"/>
-              </w:rPr>
-            </w:pPr>
           </w:p>
           <w:p>
             <w:pPr>
@@ -1179,7 +1234,21 @@
               <w:rPr>
                 <w:rFonts w:ascii="Calibri" w:hAnsi="Calibri"/>
               </w:rPr>
-              <w:t>Dashboard Operativo e Interfaz Geográfica: Capturas de pantalla de la interfaz maquetada con el tema claro institucional, el mapa interactivo con capas de calor/choropleth con Leaflet / OpenStreetMap, el motor de ruteo OSRM y la tabla de control con la máquina de estados radiales (6-0 a 6-9).</w:t>
+              <w:t>Dashboard Operativo e Interfaz Geográfica: Capturas de pantalla de la interfaz maquetada con el tema claro institucional, el mapa interactivo con capas de calor/</w:t>
+            </w:r>
+            <w:proofErr w:type="spellStart"/>
+            <w:r>
+              <w:rPr>
+                <w:rFonts w:ascii="Calibri" w:hAnsi="Calibri"/>
+              </w:rPr>
+              <w:t>choropleth</w:t>
+            </w:r>
+            <w:proofErr w:type="spellEnd"/>
+            <w:r>
+              <w:rPr>
+                <w:rFonts w:ascii="Calibri" w:hAnsi="Calibri"/>
+              </w:rPr>
+              <w:t xml:space="preserve"> con Leaflet / OpenStreetMap, el motor de ruteo OSRM y la tabla de control con la máquina de estados radiales (6-0 a 6-9).</w:t>
             </w:r>
           </w:p>
           <w:p>
@@ -1205,7 +1274,42 @@
               <w:rPr>
                 <w:rFonts w:ascii="Calibri" w:hAnsi="Calibri"/>
               </w:rPr>
-              <w:t>Infraestructura Contenedorizada y Documentación de la API: Archivo docker-compose.yml para la orquestación del backend y servidor OSRM, esquema relacional preparado para PostgreSQL 16 (con gestión temporal de estado en memoria en FastAPI), junto con la interfaz interactiva de Swagger UI (/docs) que valida el funcionamiento de la autenticación JWT y el control de acceso basado en roles (RBAC).</w:t>
+              <w:t xml:space="preserve">Infraestructura </w:t>
+            </w:r>
+            <w:proofErr w:type="spellStart"/>
+            <w:r>
+              <w:rPr>
+                <w:rFonts w:ascii="Calibri" w:hAnsi="Calibri"/>
+              </w:rPr>
+              <w:t>Contenedorizada</w:t>
+            </w:r>
+            <w:proofErr w:type="spellEnd"/>
+            <w:r>
+              <w:rPr>
+                <w:rFonts w:ascii="Calibri" w:hAnsi="Calibri"/>
+              </w:rPr>
+              <w:t xml:space="preserve"> y Documentación de la API: Archivo docker-</w:t>
+            </w:r>
+            <w:proofErr w:type="spellStart"/>
+            <w:r>
+              <w:rPr>
+                <w:rFonts w:ascii="Calibri" w:hAnsi="Calibri"/>
+              </w:rPr>
+              <w:t>compose.yml</w:t>
+            </w:r>
+            <w:proofErr w:type="spellEnd"/>
+            <w:r>
+              <w:rPr>
+                <w:rFonts w:ascii="Calibri" w:hAnsi="Calibri"/>
+              </w:rPr>
+              <w:t xml:space="preserve"> para la orquestación del backend y servidor OSRM, persistencia real en PostgreSQL 16 (SQLAlchemy + Alembic) para el módulo de Emergencia y Operación, junto con la interfaz interactiva de Swagger UI (/docs) que valida el funcionamiento de la autenticación JWT y el control de acceso basado en roles (RBAC).</w:t>
+            </w:r>
+            <w:r>
+              <w:rPr>
+                <w:rFonts w:ascii="Calibri" w:hAnsi="Calibri"/>
+              </w:rPr>
+              <w:br/>
+              <w:t>Módulo de Tickets de Soporte: Gestión de incidencias reportadas por los usuarios, con generación de tickets numerados (SOP-000X) y panel de seguimiento para el rol Soporte.</w:t>
             </w:r>
           </w:p>
           <w:p>
@@ -1224,7 +1328,21 @@
               <w:rPr>
                 <w:rFonts w:ascii="Calibri" w:hAnsi="Calibri"/>
               </w:rPr>
-              <w:t>Resguardo de la calidad: El resguardo de la calidad técnica se garantizó mediante el control de versiones con Git bajo flujo de ramas por funcionalidad (ej. feature-benjamin-ui-theme), la gestión de secretos sensibles con archivos de entorno (.env.example) y el uso de un conjunto de datos de validación completamente independiente (generate_validation_dataset.py) para evitar el sobreajuste (overfitting) en el modelo de aprendizaje automático.</w:t>
+              <w:t>Resguardo de la calidad: El resguardo de la calidad técnica se garantizó mediante el control de versiones con Git bajo flujo de ramas por funcionalidad (ej. feature-benjamin-ui-theme), la gestión de secretos sensibles con archivos de entorno (.env.example) y el uso de un conjunto de datos de validación completamente independiente (generate_validation_dataset.py) para evitar el sobreajuste (</w:t>
+            </w:r>
+            <w:proofErr w:type="spellStart"/>
+            <w:r>
+              <w:rPr>
+                <w:rFonts w:ascii="Calibri" w:hAnsi="Calibri"/>
+              </w:rPr>
+              <w:t>overfitting</w:t>
+            </w:r>
+            <w:proofErr w:type="spellEnd"/>
+            <w:r>
+              <w:rPr>
+                <w:rFonts w:ascii="Calibri" w:hAnsi="Calibri"/>
+              </w:rPr>
+              <w:t>) en el modelo de aprendizaje automático.</w:t>
             </w:r>
             <w:r>
               <w:rPr>
@@ -1242,8 +1360,8 @@
     <w:tbl>
       <w:tblPr>
         <w:tblStyle w:val="Tablaconcuadrcula"/>
-        <w:tblpPr w:leftFromText="141" w:rightFromText="141" w:vertAnchor="text" w:horzAnchor="margin" w:tblpX="-719" w:tblpY="-116"/>
-        <w:tblW w:w="9640" w:type="dxa"/>
+        <w:tblpPr w:leftFromText="141" w:rightFromText="141" w:vertAnchor="text" w:horzAnchor="margin" w:tblpX="-1008" w:tblpY="-116"/>
+        <w:tblW w:w="10485" w:type="dxa"/>
         <w:tblBorders>
           <w:top w:val="single" w:sz="4" w:space="0" w:color="BFBFBF" w:themeColor="background1" w:themeShade="BF"/>
           <w:left w:val="single" w:sz="4" w:space="0" w:color="BFBFBF" w:themeColor="background1" w:themeShade="BF"/>
@@ -1255,15 +1373,12 @@
         <w:tblLook w:val="04A0" w:firstRow="1" w:lastRow="0" w:firstColumn="1" w:lastColumn="0" w:noHBand="0" w:noVBand="1"/>
       </w:tblPr>
       <w:tblGrid>
-        <w:gridCol w:w="9640"/>
+        <w:gridCol w:w="10485"/>
       </w:tblGrid>
       <w:tr>
-        <w:trPr>
-          <w:trHeight w:val="440"/>
-        </w:trPr>
-        <w:tc>
-          <w:tcPr>
-            <w:tcW w:w="9640" w:type="dxa"/>
+        <w:tc>
+          <w:tcPr>
+            <w:tcW w:w="10485" w:type="dxa"/>
             <w:vAlign w:val="center"/>
           </w:tcPr>
           <w:p>
@@ -1307,12 +1422,9 @@
         </w:tc>
       </w:tr>
       <w:tr>
-        <w:trPr>
-          <w:trHeight w:val="800"/>
-        </w:trPr>
-        <w:tc>
-          <w:tcPr>
-            <w:tcW w:w="9640" w:type="dxa"/>
+        <w:tc>
+          <w:tcPr>
+            <w:tcW w:w="10485" w:type="dxa"/>
             <w:shd w:val="clear" w:color="auto" w:fill="D9E2F3" w:themeFill="accent1" w:themeFillTint="33"/>
             <w:vAlign w:val="center"/>
           </w:tcPr>
@@ -1388,9 +1500,6 @@
         <w:gridCol w:w="1559"/>
       </w:tblGrid>
       <w:tr>
-        <w:trPr>
-          <w:trHeight w:val="415"/>
-        </w:trPr>
         <w:tc>
           <w:tcPr>
             <w:tcW w:w="10485" w:type="dxa"/>
@@ -1418,9 +1527,6 @@
         </w:tc>
       </w:tr>
       <w:tr>
-        <w:trPr>
-          <w:trHeight w:val="711"/>
-        </w:trPr>
         <w:tc>
           <w:tcPr>
             <w:tcW w:w="1328" w:type="dxa"/>
@@ -1648,9 +1754,6 @@
         </w:tc>
       </w:tr>
       <w:tr>
-        <w:trPr>
-          <w:trHeight w:val="2410"/>
-        </w:trPr>
         <w:tc>
           <w:tcPr>
             <w:tcW w:w="1328" w:type="dxa"/>
@@ -1871,9 +1974,6 @@
         </w:tc>
       </w:tr>
       <w:tr>
-        <w:trPr>
-          <w:trHeight w:val="2410"/>
-        </w:trPr>
         <w:tc>
           <w:tcPr>
             <w:tcW w:w="1328" w:type="dxa"/>
@@ -1951,7 +2051,51 @@
                 <w:szCs w:val="20"/>
                 <w:lang w:val="en-US" w:eastAsia="es-CL"/>
               </w:rPr>
-              <w:t>PostgreSQL, PgAdmin, DBeaver, SQL, FastAPI.</w:t>
+              <w:t xml:space="preserve">PostgreSQL, </w:t>
+            </w:r>
+            <w:proofErr w:type="spellStart"/>
+            <w:r>
+              <w:rPr>
+                <w:rFonts w:ascii="Calibri" w:hAnsi="Calibri" w:cs="Arial"/>
+                <w:iCs/>
+                <w:sz w:val="18"/>
+                <w:szCs w:val="20"/>
+                <w:lang w:val="en-US" w:eastAsia="es-CL"/>
+              </w:rPr>
+              <w:t>PgAdmin</w:t>
+            </w:r>
+            <w:proofErr w:type="spellEnd"/>
+            <w:r>
+              <w:rPr>
+                <w:rFonts w:ascii="Calibri" w:hAnsi="Calibri" w:cs="Arial"/>
+                <w:iCs/>
+                <w:sz w:val="18"/>
+                <w:szCs w:val="20"/>
+                <w:lang w:val="en-US" w:eastAsia="es-CL"/>
+              </w:rPr>
+              <w:t xml:space="preserve">, </w:t>
+            </w:r>
+            <w:proofErr w:type="spellStart"/>
+            <w:r>
+              <w:rPr>
+                <w:rFonts w:ascii="Calibri" w:hAnsi="Calibri" w:cs="Arial"/>
+                <w:iCs/>
+                <w:sz w:val="18"/>
+                <w:szCs w:val="20"/>
+                <w:lang w:val="en-US" w:eastAsia="es-CL"/>
+              </w:rPr>
+              <w:t>DBeaver</w:t>
+            </w:r>
+            <w:proofErr w:type="spellEnd"/>
+            <w:r>
+              <w:rPr>
+                <w:rFonts w:ascii="Calibri" w:hAnsi="Calibri" w:cs="Arial"/>
+                <w:iCs/>
+                <w:sz w:val="18"/>
+                <w:szCs w:val="20"/>
+                <w:lang w:val="en-US" w:eastAsia="es-CL"/>
+              </w:rPr>
+              <w:t>, SQL, FastAPI.</w:t>
             </w:r>
           </w:p>
         </w:tc>
@@ -2038,7 +2182,7 @@
                 <w:szCs w:val="20"/>
                 <w:lang w:eastAsia="es-CL"/>
               </w:rPr>
-              <w:t>Dificultad y solución: Para superar la dificultad en la sincronización fluida de los estados radiales, se implementó la gestión en memoria en FastAPI (/state), priorizando la respuesta del dashboard y reprogramando la migración formal a PostgreSQL.</w:t>
+              <w:t>Dificultad y solución: Para superar la dificultad en la sincronización fluida de los estados radiales, se completó la migración del módulo de Emergencia y Operación a PostgreSQL 16 mediante SQLAlchemy y migraciones con Alembic, reemplazando por completo la gestión en memoria que se usaba al inicio de la Fase 2.</w:t>
             </w:r>
           </w:p>
         </w:tc>
@@ -2065,7 +2209,7 @@
                 <w:szCs w:val="20"/>
                 <w:lang w:eastAsia="es-CL"/>
               </w:rPr>
-              <w:t>En curso / Reprogramado</w:t>
+              <w:t>Completado</w:t>
             </w:r>
           </w:p>
         </w:tc>
@@ -2092,15 +2236,12 @@
                 <w:szCs w:val="20"/>
                 <w:lang w:eastAsia="es-CL"/>
               </w:rPr>
-              <w:t>Reprogramado. Se pospuso la persistencia relacional para priorizar la respuesta fluida del dashboard.</w:t>
+              <w:t>Ninguno. La persistencia relacional para el módulo de Emergencia y Operación ya se encuentra implementada.</w:t>
             </w:r>
           </w:p>
         </w:tc>
       </w:tr>
       <w:tr>
-        <w:trPr>
-          <w:trHeight w:val="2410"/>
-        </w:trPr>
         <w:tc>
           <w:tcPr>
             <w:tcW w:w="1328" w:type="dxa"/>
@@ -2125,8 +2266,20 @@
                 <w:lang w:eastAsia="es-CL"/>
               </w:rPr>
               <w:lastRenderedPageBreak/>
-              <w:t>Desarrollo de Servicios Web y API RESTful</w:t>
-            </w:r>
+              <w:t xml:space="preserve">Desarrollo de Servicios Web y API </w:t>
+            </w:r>
+            <w:proofErr w:type="spellStart"/>
+            <w:r>
+              <w:rPr>
+                <w:rFonts w:ascii="Calibri" w:hAnsi="Calibri" w:cs="Arial"/>
+                <w:iCs/>
+                <w:sz w:val="18"/>
+                <w:szCs w:val="20"/>
+                <w:lang w:eastAsia="es-CL"/>
+              </w:rPr>
+              <w:t>RESTful</w:t>
+            </w:r>
+            <w:proofErr w:type="spellEnd"/>
           </w:p>
         </w:tc>
         <w:tc>
@@ -2179,7 +2332,29 @@
                 <w:szCs w:val="20"/>
                 <w:lang w:val="en-US" w:eastAsia="es-CL"/>
               </w:rPr>
-              <w:t>Python, FastAPI, PyJWT, Bcrypt, Swagger UI (/docs).</w:t>
+              <w:t xml:space="preserve">Python, FastAPI, </w:t>
+            </w:r>
+            <w:proofErr w:type="spellStart"/>
+            <w:r>
+              <w:rPr>
+                <w:rFonts w:ascii="Calibri" w:hAnsi="Calibri" w:cs="Arial"/>
+                <w:iCs/>
+                <w:sz w:val="18"/>
+                <w:szCs w:val="20"/>
+                <w:lang w:val="en-US" w:eastAsia="es-CL"/>
+              </w:rPr>
+              <w:t>PyJWT</w:t>
+            </w:r>
+            <w:proofErr w:type="spellEnd"/>
+            <w:r>
+              <w:rPr>
+                <w:rFonts w:ascii="Calibri" w:hAnsi="Calibri" w:cs="Arial"/>
+                <w:iCs/>
+                <w:sz w:val="18"/>
+                <w:szCs w:val="20"/>
+                <w:lang w:val="en-US" w:eastAsia="es-CL"/>
+              </w:rPr>
+              <w:t>, Bcrypt, Swagger UI (/docs).</w:t>
             </w:r>
           </w:p>
         </w:tc>
@@ -2235,17 +2410,10 @@
                 <w:szCs w:val="20"/>
                 <w:lang w:eastAsia="es-CL"/>
               </w:rPr>
-              <w:t>Alexsander Aravena / Benjamin Saavedra</w:t>
-            </w:r>
-          </w:p>
-        </w:tc>
-        <w:tc>
-          <w:tcPr>
-            <w:tcW w:w="1560" w:type="dxa"/>
-          </w:tcPr>
-          <w:p>
-            <w:pPr>
-              <w:jc w:val="both"/>
+              <w:t xml:space="preserve">Alexsander Aravena / </w:t>
+            </w:r>
+            <w:proofErr w:type="spellStart"/>
+            <w:r>
               <w:rPr>
                 <w:rFonts w:ascii="Calibri" w:hAnsi="Calibri" w:cs="Arial"/>
                 <w:b/>
@@ -2253,9 +2421,11 @@
                 <w:iCs/>
                 <w:sz w:val="18"/>
                 <w:szCs w:val="20"/>
-                <w:lang w:val="es-MX" w:eastAsia="es-CL"/>
-              </w:rPr>
-            </w:pPr>
+                <w:lang w:eastAsia="es-CL"/>
+              </w:rPr>
+              <w:t>Benjamin</w:t>
+            </w:r>
+            <w:proofErr w:type="spellEnd"/>
             <w:r>
               <w:rPr>
                 <w:rFonts w:ascii="Calibri" w:hAnsi="Calibri" w:cs="Arial"/>
@@ -2266,52 +2436,17 @@
                 <w:szCs w:val="20"/>
                 <w:lang w:eastAsia="es-CL"/>
               </w:rPr>
-              <w:t>Facilitador: La documentación interactiva Swagger UI (/docs) generada por FastAPI permitió probar y validar la autenticación JWT y roles (RBAC) sin dependencias externas.</w:t>
-            </w:r>
-          </w:p>
-        </w:tc>
-        <w:tc>
-          <w:tcPr>
-            <w:tcW w:w="1134" w:type="dxa"/>
+              <w:t xml:space="preserve"> Saavedra</w:t>
+            </w:r>
+          </w:p>
+        </w:tc>
+        <w:tc>
+          <w:tcPr>
+            <w:tcW w:w="1560" w:type="dxa"/>
           </w:tcPr>
           <w:p>
             <w:pPr>
               <w:jc w:val="both"/>
-              <w:rPr>
-                <w:rFonts w:ascii="Calibri" w:hAnsi="Calibri" w:cs="Arial"/>
-                <w:iCs/>
-                <w:sz w:val="18"/>
-                <w:szCs w:val="20"/>
-                <w:lang w:val="es-MX" w:eastAsia="es-CL"/>
-              </w:rPr>
-            </w:pPr>
-            <w:r>
-              <w:rPr>
-                <w:rFonts w:ascii="Calibri" w:hAnsi="Calibri" w:cs="Arial"/>
-                <w:iCs/>
-                <w:sz w:val="18"/>
-                <w:szCs w:val="20"/>
-                <w:lang w:eastAsia="es-CL"/>
-              </w:rPr>
-              <w:t>Completado</w:t>
-            </w:r>
-          </w:p>
-        </w:tc>
-        <w:tc>
-          <w:tcPr>
-            <w:tcW w:w="1559" w:type="dxa"/>
-          </w:tcPr>
-          <w:p>
-            <w:pPr>
-              <w:rPr>
-                <w:rFonts w:ascii="Calibri" w:hAnsi="Calibri" w:cs="Arial"/>
-                <w:iCs/>
-                <w:sz w:val="18"/>
-                <w:szCs w:val="20"/>
-                <w:lang w:val="es-MX" w:eastAsia="es-CL"/>
-              </w:rPr>
-            </w:pPr>
-            <w:r>
               <w:rPr>
                 <w:rFonts w:ascii="Calibri" w:hAnsi="Calibri" w:cs="Arial"/>
                 <w:b/>
@@ -2319,6 +2454,72 @@
                 <w:iCs/>
                 <w:sz w:val="18"/>
                 <w:szCs w:val="20"/>
+                <w:lang w:val="es-MX" w:eastAsia="es-CL"/>
+              </w:rPr>
+            </w:pPr>
+            <w:r>
+              <w:rPr>
+                <w:rFonts w:ascii="Calibri" w:hAnsi="Calibri" w:cs="Arial"/>
+                <w:b/>
+                <w:bCs/>
+                <w:iCs/>
+                <w:sz w:val="18"/>
+                <w:szCs w:val="20"/>
+                <w:lang w:eastAsia="es-CL"/>
+              </w:rPr>
+              <w:t>Facilitador: La documentación interactiva Swagger UI (/docs) generada por FastAPI permitió probar y validar la autenticación JWT y roles (RBAC) sin dependencias externas.</w:t>
+            </w:r>
+          </w:p>
+        </w:tc>
+        <w:tc>
+          <w:tcPr>
+            <w:tcW w:w="1134" w:type="dxa"/>
+          </w:tcPr>
+          <w:p>
+            <w:pPr>
+              <w:jc w:val="both"/>
+              <w:rPr>
+                <w:rFonts w:ascii="Calibri" w:hAnsi="Calibri" w:cs="Arial"/>
+                <w:iCs/>
+                <w:sz w:val="18"/>
+                <w:szCs w:val="20"/>
+                <w:lang w:val="es-MX" w:eastAsia="es-CL"/>
+              </w:rPr>
+            </w:pPr>
+            <w:r>
+              <w:rPr>
+                <w:rFonts w:ascii="Calibri" w:hAnsi="Calibri" w:cs="Arial"/>
+                <w:iCs/>
+                <w:sz w:val="18"/>
+                <w:szCs w:val="20"/>
+                <w:lang w:eastAsia="es-CL"/>
+              </w:rPr>
+              <w:t>Completado</w:t>
+            </w:r>
+          </w:p>
+        </w:tc>
+        <w:tc>
+          <w:tcPr>
+            <w:tcW w:w="1559" w:type="dxa"/>
+          </w:tcPr>
+          <w:p>
+            <w:pPr>
+              <w:rPr>
+                <w:rFonts w:ascii="Calibri" w:hAnsi="Calibri" w:cs="Arial"/>
+                <w:iCs/>
+                <w:sz w:val="18"/>
+                <w:szCs w:val="20"/>
+                <w:lang w:val="es-MX" w:eastAsia="es-CL"/>
+              </w:rPr>
+            </w:pPr>
+            <w:r>
+              <w:rPr>
+                <w:rFonts w:ascii="Calibri" w:hAnsi="Calibri" w:cs="Arial"/>
+                <w:b/>
+                <w:bCs/>
+                <w:iCs/>
+                <w:sz w:val="18"/>
+                <w:szCs w:val="20"/>
                 <w:lang w:eastAsia="es-CL"/>
               </w:rPr>
               <w:t>Ninguno.</w:t>
@@ -2337,9 +2538,6 @@
         </w:tc>
       </w:tr>
       <w:tr>
-        <w:trPr>
-          <w:trHeight w:val="2410"/>
-        </w:trPr>
         <w:tc>
           <w:tcPr>
             <w:tcW w:w="1328" w:type="dxa"/>
@@ -2463,6 +2661,7 @@
                 <w:lang w:val="en-US" w:eastAsia="es-CL"/>
               </w:rPr>
             </w:pPr>
+            <w:proofErr w:type="spellStart"/>
             <w:r>
               <w:rPr>
                 <w:rFonts w:ascii="Calibri" w:hAnsi="Calibri" w:cs="Arial"/>
@@ -2473,17 +2672,10 @@
                 <w:szCs w:val="20"/>
                 <w:lang w:eastAsia="es-CL"/>
               </w:rPr>
-              <w:t>Benjamin Saavedra</w:t>
-            </w:r>
-          </w:p>
-        </w:tc>
-        <w:tc>
-          <w:tcPr>
-            <w:tcW w:w="1560" w:type="dxa"/>
-          </w:tcPr>
-          <w:p>
-            <w:pPr>
-              <w:jc w:val="both"/>
+              <w:t>Benjamin</w:t>
+            </w:r>
+            <w:proofErr w:type="spellEnd"/>
+            <w:r>
               <w:rPr>
                 <w:rFonts w:ascii="Calibri" w:hAnsi="Calibri" w:cs="Arial"/>
                 <w:b/>
@@ -2491,10 +2683,19 @@
                 <w:iCs/>
                 <w:sz w:val="18"/>
                 <w:szCs w:val="20"/>
-                <w:lang w:val="es-MX" w:eastAsia="es-CL"/>
-              </w:rPr>
-            </w:pPr>
-            <w:r>
+                <w:lang w:eastAsia="es-CL"/>
+              </w:rPr>
+              <w:t xml:space="preserve"> Saavedra</w:t>
+            </w:r>
+          </w:p>
+        </w:tc>
+        <w:tc>
+          <w:tcPr>
+            <w:tcW w:w="1560" w:type="dxa"/>
+          </w:tcPr>
+          <w:p>
+            <w:pPr>
+              <w:jc w:val="both"/>
               <w:rPr>
                 <w:rFonts w:ascii="Calibri" w:hAnsi="Calibri" w:cs="Arial"/>
                 <w:b/>
@@ -2502,6 +2703,17 @@
                 <w:iCs/>
                 <w:sz w:val="18"/>
                 <w:szCs w:val="20"/>
+                <w:lang w:val="es-MX" w:eastAsia="es-CL"/>
+              </w:rPr>
+            </w:pPr>
+            <w:r>
+              <w:rPr>
+                <w:rFonts w:ascii="Calibri" w:hAnsi="Calibri" w:cs="Arial"/>
+                <w:b/>
+                <w:bCs/>
+                <w:iCs/>
+                <w:sz w:val="18"/>
+                <w:szCs w:val="20"/>
                 <w:lang w:eastAsia="es-CL"/>
               </w:rPr>
               <w:t>Dificultad y solución: Para resolver la complejidad de un panel de emergencias en tiempo real, se diseñó una maquetación en React optimizada para el renderizado fluido de mapas y estados radiales (6-0 a 6-9).</w:t>
@@ -2576,9 +2788,6 @@
         </w:tc>
       </w:tr>
       <w:tr>
-        <w:trPr>
-          <w:trHeight w:val="2410"/>
-        </w:trPr>
         <w:tc>
           <w:tcPr>
             <w:tcW w:w="1328" w:type="dxa"/>
@@ -2602,7 +2811,7 @@
                 <w:szCs w:val="20"/>
                 <w:lang w:eastAsia="es-CL"/>
               </w:rPr>
-              <w:t>Aseguramiento de Calidad y Pruebas de Software</w:t>
+              <w:t>Desarrollo de Software y Experiencia de Usuario</w:t>
             </w:r>
           </w:p>
         </w:tc>
@@ -2629,7 +2838,7 @@
                 <w:szCs w:val="20"/>
                 <w:lang w:eastAsia="es-CL"/>
               </w:rPr>
-              <w:t>Ejecución de pruebas integrales de seguridad, validación de variables de entorno e integración backend-frontend.</w:t>
+              <w:t>Implementación del módulo de Tickets de Soporte: creación, clasificación, seguimiento de estado y comunicación entre usuarios y el rol Soporte.</w:t>
             </w:r>
           </w:p>
         </w:tc>
@@ -2645,18 +2854,18 @@
                 <w:iCs/>
                 <w:sz w:val="18"/>
                 <w:szCs w:val="20"/>
-                <w:lang w:val="es-MX" w:eastAsia="es-CL"/>
-              </w:rPr>
-            </w:pPr>
-            <w:r>
-              <w:rPr>
-                <w:rFonts w:ascii="Calibri" w:hAnsi="Calibri" w:cs="Arial"/>
-                <w:iCs/>
-                <w:sz w:val="18"/>
-                <w:szCs w:val="20"/>
-                <w:lang w:eastAsia="es-CL"/>
-              </w:rPr>
-              <w:t>Pytest, Swagger UI, scripts de evaluación en Python, GitHub.</w:t>
+                <w:lang w:val="en-US" w:eastAsia="es-CL"/>
+              </w:rPr>
+            </w:pPr>
+            <w:r>
+              <w:rPr>
+                <w:rFonts w:ascii="Calibri" w:hAnsi="Calibri" w:cs="Arial"/>
+                <w:iCs/>
+                <w:sz w:val="18"/>
+                <w:szCs w:val="20"/>
+                <w:lang w:val="en-US" w:eastAsia="es-CL"/>
+              </w:rPr>
+              <w:t>React 18, TypeScript, Vite</w:t>
             </w:r>
           </w:p>
         </w:tc>
@@ -2672,7 +2881,7 @@
                 <w:iCs/>
                 <w:sz w:val="18"/>
                 <w:szCs w:val="20"/>
-                <w:lang w:val="es-MX" w:eastAsia="es-CL"/>
+                <w:lang w:val="en-US" w:eastAsia="es-CL"/>
               </w:rPr>
             </w:pPr>
             <w:r>
@@ -2699,7 +2908,7 @@
                 <w:iCs/>
                 <w:sz w:val="18"/>
                 <w:szCs w:val="20"/>
-                <w:lang w:val="es-MX" w:eastAsia="es-CL"/>
+                <w:lang w:val="en-US" w:eastAsia="es-CL"/>
               </w:rPr>
             </w:pPr>
             <w:r>
@@ -2712,7 +2921,7 @@
                 <w:szCs w:val="20"/>
                 <w:lang w:eastAsia="es-CL"/>
               </w:rPr>
-              <w:t>Benjamin Saavedra / Alexsander Aravena</w:t>
+              <w:t>Bruno Molina</w:t>
             </w:r>
           </w:p>
         </w:tc>
@@ -2743,7 +2952,7 @@
                 <w:szCs w:val="20"/>
                 <w:lang w:eastAsia="es-CL"/>
               </w:rPr>
-              <w:t>Observación: Se ejecutó la validación continua en Swagger UI y métricas de modelos predictivos. La suite de pruebas automatizadas con Pytest queda reprogramada para el acoplamiento final del frontend.</w:t>
+              <w:t>Facilitador: se amplió el alcance original de la Fase 2 para incorporar este módulo, no contemplado en la planificación inicial.</w:t>
             </w:r>
           </w:p>
         </w:tc>
@@ -2770,6 +2979,320 @@
                 <w:szCs w:val="20"/>
                 <w:lang w:eastAsia="es-CL"/>
               </w:rPr>
+              <w:t>Completado</w:t>
+            </w:r>
+          </w:p>
+          <w:p>
+            <w:pPr>
+              <w:jc w:val="center"/>
+              <w:rPr>
+                <w:rFonts w:ascii="Calibri" w:hAnsi="Calibri" w:cs="Arial"/>
+                <w:iCs/>
+                <w:sz w:val="18"/>
+                <w:szCs w:val="20"/>
+                <w:lang w:val="es-MX" w:eastAsia="es-CL"/>
+              </w:rPr>
+            </w:pPr>
+          </w:p>
+        </w:tc>
+        <w:tc>
+          <w:tcPr>
+            <w:tcW w:w="1559" w:type="dxa"/>
+          </w:tcPr>
+          <w:p>
+            <w:pPr>
+              <w:jc w:val="both"/>
+              <w:rPr>
+                <w:rFonts w:ascii="Calibri" w:hAnsi="Calibri" w:cs="Arial"/>
+                <w:iCs/>
+                <w:sz w:val="18"/>
+                <w:szCs w:val="20"/>
+                <w:lang w:val="es-MX" w:eastAsia="es-CL"/>
+              </w:rPr>
+            </w:pPr>
+            <w:r>
+              <w:rPr>
+                <w:rFonts w:ascii="Calibri" w:hAnsi="Calibri" w:cs="Arial"/>
+                <w:iCs/>
+                <w:sz w:val="18"/>
+                <w:szCs w:val="20"/>
+                <w:lang w:eastAsia="es-CL"/>
+              </w:rPr>
+              <w:t>Nueva actividad agregada durante la Fase 2.</w:t>
+            </w:r>
+          </w:p>
+        </w:tc>
+      </w:tr>
+      <w:tr>
+        <w:tc>
+          <w:tcPr>
+            <w:tcW w:w="1328" w:type="dxa"/>
+          </w:tcPr>
+          <w:p>
+            <w:pPr>
+              <w:jc w:val="center"/>
+              <w:rPr>
+                <w:rFonts w:ascii="Calibri" w:hAnsi="Calibri" w:cs="Arial"/>
+                <w:iCs/>
+                <w:sz w:val="18"/>
+                <w:szCs w:val="20"/>
+                <w:lang w:val="es-MX" w:eastAsia="es-CL"/>
+              </w:rPr>
+            </w:pPr>
+            <w:r>
+              <w:rPr>
+                <w:rFonts w:ascii="Calibri" w:hAnsi="Calibri" w:cs="Arial"/>
+                <w:iCs/>
+                <w:sz w:val="18"/>
+                <w:szCs w:val="20"/>
+                <w:lang w:eastAsia="es-CL"/>
+              </w:rPr>
+              <w:t>Aseguramiento de Calidad y Pruebas de Software</w:t>
+            </w:r>
+          </w:p>
+        </w:tc>
+        <w:tc>
+          <w:tcPr>
+            <w:tcW w:w="1077" w:type="dxa"/>
+          </w:tcPr>
+          <w:p>
+            <w:pPr>
+              <w:jc w:val="both"/>
+              <w:rPr>
+                <w:rFonts w:ascii="Calibri" w:hAnsi="Calibri" w:cs="Arial"/>
+                <w:iCs/>
+                <w:sz w:val="18"/>
+                <w:szCs w:val="20"/>
+                <w:lang w:val="es-MX" w:eastAsia="es-CL"/>
+              </w:rPr>
+            </w:pPr>
+            <w:r>
+              <w:rPr>
+                <w:rFonts w:ascii="Calibri" w:hAnsi="Calibri" w:cs="Arial"/>
+                <w:iCs/>
+                <w:sz w:val="18"/>
+                <w:szCs w:val="20"/>
+                <w:lang w:eastAsia="es-CL"/>
+              </w:rPr>
+              <w:t xml:space="preserve">Ejecución de pruebas integrales de seguridad, validación de variables de entorno e integración </w:t>
+            </w:r>
+            <w:r>
+              <w:rPr>
+                <w:rFonts w:ascii="Calibri" w:hAnsi="Calibri" w:cs="Arial"/>
+                <w:iCs/>
+                <w:sz w:val="18"/>
+                <w:szCs w:val="20"/>
+                <w:lang w:eastAsia="es-CL"/>
+              </w:rPr>
+              <w:lastRenderedPageBreak/>
+              <w:t>backend-frontend.</w:t>
+            </w:r>
+          </w:p>
+        </w:tc>
+        <w:tc>
+          <w:tcPr>
+            <w:tcW w:w="1276" w:type="dxa"/>
+          </w:tcPr>
+          <w:p>
+            <w:pPr>
+              <w:jc w:val="both"/>
+              <w:rPr>
+                <w:rFonts w:ascii="Calibri" w:hAnsi="Calibri" w:cs="Arial"/>
+                <w:iCs/>
+                <w:sz w:val="18"/>
+                <w:szCs w:val="20"/>
+                <w:lang w:val="es-MX" w:eastAsia="es-CL"/>
+              </w:rPr>
+            </w:pPr>
+            <w:proofErr w:type="spellStart"/>
+            <w:r>
+              <w:rPr>
+                <w:rFonts w:ascii="Calibri" w:hAnsi="Calibri" w:cs="Arial"/>
+                <w:iCs/>
+                <w:sz w:val="18"/>
+                <w:szCs w:val="20"/>
+                <w:lang w:eastAsia="es-CL"/>
+              </w:rPr>
+              <w:lastRenderedPageBreak/>
+              <w:t>Pytest</w:t>
+            </w:r>
+            <w:proofErr w:type="spellEnd"/>
+            <w:r>
+              <w:rPr>
+                <w:rFonts w:ascii="Calibri" w:hAnsi="Calibri" w:cs="Arial"/>
+                <w:iCs/>
+                <w:sz w:val="18"/>
+                <w:szCs w:val="20"/>
+                <w:lang w:eastAsia="es-CL"/>
+              </w:rPr>
+              <w:t>, Swagger UI, scripts de evaluación en Python, GitHub.</w:t>
+            </w:r>
+          </w:p>
+        </w:tc>
+        <w:tc>
+          <w:tcPr>
+            <w:tcW w:w="1276" w:type="dxa"/>
+          </w:tcPr>
+          <w:p>
+            <w:pPr>
+              <w:jc w:val="both"/>
+              <w:rPr>
+                <w:rFonts w:ascii="Calibri" w:hAnsi="Calibri" w:cs="Arial"/>
+                <w:iCs/>
+                <w:sz w:val="18"/>
+                <w:szCs w:val="20"/>
+                <w:lang w:val="es-MX" w:eastAsia="es-CL"/>
+              </w:rPr>
+            </w:pPr>
+            <w:r>
+              <w:rPr>
+                <w:rFonts w:ascii="Calibri" w:hAnsi="Calibri" w:cs="Arial"/>
+                <w:iCs/>
+                <w:sz w:val="18"/>
+                <w:szCs w:val="20"/>
+                <w:lang w:eastAsia="es-CL"/>
+              </w:rPr>
+              <w:t>1 semana</w:t>
+            </w:r>
+          </w:p>
+        </w:tc>
+        <w:tc>
+          <w:tcPr>
+            <w:tcW w:w="1275" w:type="dxa"/>
+          </w:tcPr>
+          <w:p>
+            <w:pPr>
+              <w:jc w:val="both"/>
+              <w:rPr>
+                <w:rFonts w:ascii="Calibri" w:hAnsi="Calibri" w:cs="Arial"/>
+                <w:iCs/>
+                <w:sz w:val="18"/>
+                <w:szCs w:val="20"/>
+                <w:lang w:val="es-MX" w:eastAsia="es-CL"/>
+              </w:rPr>
+            </w:pPr>
+            <w:proofErr w:type="spellStart"/>
+            <w:r>
+              <w:rPr>
+                <w:rFonts w:ascii="Calibri" w:hAnsi="Calibri" w:cs="Arial"/>
+                <w:b/>
+                <w:bCs/>
+                <w:iCs/>
+                <w:sz w:val="18"/>
+                <w:szCs w:val="20"/>
+                <w:lang w:eastAsia="es-CL"/>
+              </w:rPr>
+              <w:t>Benjamin</w:t>
+            </w:r>
+            <w:proofErr w:type="spellEnd"/>
+            <w:r>
+              <w:rPr>
+                <w:rFonts w:ascii="Calibri" w:hAnsi="Calibri" w:cs="Arial"/>
+                <w:b/>
+                <w:bCs/>
+                <w:iCs/>
+                <w:sz w:val="18"/>
+                <w:szCs w:val="20"/>
+                <w:lang w:eastAsia="es-CL"/>
+              </w:rPr>
+              <w:t xml:space="preserve"> Saavedra / Alexsander Aravena</w:t>
+            </w:r>
+          </w:p>
+        </w:tc>
+        <w:tc>
+          <w:tcPr>
+            <w:tcW w:w="1560" w:type="dxa"/>
+          </w:tcPr>
+          <w:p>
+            <w:pPr>
+              <w:jc w:val="both"/>
+              <w:rPr>
+                <w:rFonts w:ascii="Calibri" w:hAnsi="Calibri" w:cs="Arial"/>
+                <w:b/>
+                <w:bCs/>
+                <w:iCs/>
+                <w:sz w:val="18"/>
+                <w:szCs w:val="20"/>
+                <w:lang w:val="es-MX" w:eastAsia="es-CL"/>
+              </w:rPr>
+            </w:pPr>
+            <w:r>
+              <w:rPr>
+                <w:rFonts w:ascii="Calibri" w:hAnsi="Calibri" w:cs="Arial"/>
+                <w:b/>
+                <w:bCs/>
+                <w:iCs/>
+                <w:sz w:val="18"/>
+                <w:szCs w:val="20"/>
+                <w:lang w:eastAsia="es-CL"/>
+              </w:rPr>
+              <w:t xml:space="preserve">Observación: Se ejecutó la validación continua en Swagger UI y métricas de modelos predictivos. La suite de pruebas automatizadas con </w:t>
+            </w:r>
+            <w:proofErr w:type="spellStart"/>
+            <w:r>
+              <w:rPr>
+                <w:rFonts w:ascii="Calibri" w:hAnsi="Calibri" w:cs="Arial"/>
+                <w:b/>
+                <w:bCs/>
+                <w:iCs/>
+                <w:sz w:val="18"/>
+                <w:szCs w:val="20"/>
+                <w:lang w:eastAsia="es-CL"/>
+              </w:rPr>
+              <w:t>Pytest</w:t>
+            </w:r>
+            <w:proofErr w:type="spellEnd"/>
+            <w:r>
+              <w:rPr>
+                <w:rFonts w:ascii="Calibri" w:hAnsi="Calibri" w:cs="Arial"/>
+                <w:b/>
+                <w:bCs/>
+                <w:iCs/>
+                <w:sz w:val="18"/>
+                <w:szCs w:val="20"/>
+                <w:lang w:eastAsia="es-CL"/>
+              </w:rPr>
+              <w:t xml:space="preserve"> queda </w:t>
+            </w:r>
+            <w:r>
+              <w:rPr>
+                <w:rFonts w:ascii="Calibri" w:hAnsi="Calibri" w:cs="Arial"/>
+                <w:b/>
+                <w:bCs/>
+                <w:iCs/>
+                <w:sz w:val="18"/>
+                <w:szCs w:val="20"/>
+                <w:lang w:eastAsia="es-CL"/>
+              </w:rPr>
+              <w:lastRenderedPageBreak/>
+              <w:t>reprogramada para el acoplamiento final del frontend.</w:t>
+            </w:r>
+          </w:p>
+        </w:tc>
+        <w:tc>
+          <w:tcPr>
+            <w:tcW w:w="1134" w:type="dxa"/>
+          </w:tcPr>
+          <w:p>
+            <w:pPr>
+              <w:jc w:val="both"/>
+              <w:rPr>
+                <w:rFonts w:ascii="Calibri" w:hAnsi="Calibri" w:cs="Arial"/>
+                <w:iCs/>
+                <w:sz w:val="18"/>
+                <w:szCs w:val="20"/>
+                <w:lang w:val="es-MX" w:eastAsia="es-CL"/>
+              </w:rPr>
+            </w:pPr>
+            <w:r>
+              <w:rPr>
+                <w:rFonts w:ascii="Calibri" w:hAnsi="Calibri" w:cs="Arial"/>
+                <w:iCs/>
+                <w:sz w:val="18"/>
+                <w:szCs w:val="20"/>
+                <w:lang w:eastAsia="es-CL"/>
+              </w:rPr>
+              <w:lastRenderedPageBreak/>
               <w:t>En curso / Reprogramado</w:t>
             </w:r>
           </w:p>
@@ -2822,40 +3345,6 @@
           <w:color w:val="595959" w:themeColor="text1" w:themeTint="A6"/>
           <w:sz w:val="24"/>
           <w:szCs w:val="24"/>
-          <w:lang w:val="es-MX"/>
-        </w:rPr>
-      </w:pPr>
-    </w:p>
-    <w:p>
-      <w:pPr>
-        <w:rPr>
-          <w:rFonts w:cs="Calibri Light"/>
-          <w:color w:val="595959" w:themeColor="text1" w:themeTint="A6"/>
-          <w:sz w:val="24"/>
-          <w:szCs w:val="24"/>
-          <w:lang w:val="es-MX"/>
-        </w:rPr>
-      </w:pPr>
-    </w:p>
-    <w:p>
-      <w:pPr>
-        <w:rPr>
-          <w:rFonts w:cs="Calibri Light"/>
-          <w:color w:val="595959" w:themeColor="text1" w:themeTint="A6"/>
-          <w:sz w:val="24"/>
-          <w:szCs w:val="24"/>
-          <w:lang w:val="es-MX"/>
-        </w:rPr>
-      </w:pPr>
-    </w:p>
-    <w:p>
-      <w:pPr>
-        <w:rPr>
-          <w:rFonts w:cs="Calibri Light"/>
-          <w:color w:val="595959" w:themeColor="text1" w:themeTint="A6"/>
-          <w:sz w:val="24"/>
-          <w:szCs w:val="24"/>
-          <w:lang w:val="es-MX"/>
         </w:rPr>
       </w:pPr>
     </w:p>
@@ -2889,9 +3378,6 @@
         <w:gridCol w:w="9498"/>
       </w:tblGrid>
       <w:tr>
-        <w:trPr>
-          <w:trHeight w:val="440"/>
-        </w:trPr>
         <w:tc>
           <w:tcPr>
             <w:tcW w:w="9498" w:type="dxa"/>
@@ -2913,7 +3399,6 @@
                 <w:sz w:val="28"/>
                 <w:szCs w:val="28"/>
               </w:rPr>
-              <w:lastRenderedPageBreak/>
               <w:t>3</w:t>
             </w:r>
             <w:r>
@@ -2938,9 +3423,6 @@
         </w:tc>
       </w:tr>
       <w:tr>
-        <w:trPr>
-          <w:trHeight w:val="800"/>
-        </w:trPr>
         <w:tc>
           <w:tcPr>
             <w:tcW w:w="9498" w:type="dxa"/>
@@ -3046,9 +3528,6 @@
         <w:gridCol w:w="9496"/>
       </w:tblGrid>
       <w:tr>
-        <w:trPr>
-          <w:trHeight w:val="1936"/>
-        </w:trPr>
         <w:tc>
           <w:tcPr>
             <w:tcW w:w="5000" w:type="pct"/>
@@ -3085,7 +3564,21 @@
                 <w:rFonts w:ascii="Calibri" w:hAnsi="Calibri"/>
                 <w:lang w:val="es-MX"/>
               </w:rPr>
-              <w:t xml:space="preserve">En el desarrollo del proyecto Alerta360, la adopción de contenedores mediante Docker y Docker Compose junto con una arquitectura desacoplada basada en FastAPI (Python) y React + Vite ha sido un factor facilitador decisivo. Esta elección permitió estandarizar el entorno de desarrollo entre los integrantes del equipo (Benjamin Saavedra, Bruno Molina y Alexsander Aravena), eliminando incompatibilidades de versiones y posibilitando el trabajo simultáneo en la maquetación visual, la API REST y los modelos de Machine Learning. De igual forma, el uso de la interfaz interactiva Swagger UI (/docs) generada automáticamente por FastAPI permitió probar y validar tempranamente la lógica de autenticación JWT y el control de acceso por roles (RBAC) de forma ágil y sin dependencias externas. </w:t>
+              <w:t>En el desarrollo del proyecto Alerta360, la adopción de contenedores mediante Docker y Docker Compose junto con una arquitectura desacoplada basada en FastAPI (Python) y React + Vite ha sido un factor facilitador decisivo. Esta elección permitió estandarizar el entorno de desarrollo entre los integrantes del equipo (</w:t>
+            </w:r>
+            <w:r>
+              <w:rPr>
+                <w:rFonts w:ascii="Calibri" w:hAnsi="Calibri"/>
+                <w:lang w:val="es-MX"/>
+              </w:rPr>
+              <w:t>Benjamín</w:t>
+            </w:r>
+            <w:r>
+              <w:rPr>
+                <w:rFonts w:ascii="Calibri" w:hAnsi="Calibri"/>
+                <w:lang w:val="es-MX"/>
+              </w:rPr>
+              <w:t xml:space="preserve"> Saavedra, Bruno Molina y Alexsander Aravena), eliminando incompatibilidades de versiones y posibilitando el trabajo simultáneo en la maquetación visual, la API REST y los modelos de Machine Learning. De igual forma, el uso de la interfaz interactiva Swagger UI (/docs) generada automáticamente por FastAPI permitió probar y validar tempranamente la lógica de autenticación JWT y el control de acceso por roles (RBAC) de forma ágil y sin dependencias externas. </w:t>
             </w:r>
           </w:p>
           <w:p>
@@ -3101,77 +3594,23 @@
                 <w:rFonts w:ascii="Calibri" w:hAnsi="Calibri"/>
                 <w:lang w:val="es-MX"/>
               </w:rPr>
-              <w:t xml:space="preserve">Por otro lado, la principal dificultad técnica residió en el proceso de búsqueda y ajuste de hiperparámetros de los modelos predictivos para estimar la demanda operacional en las </w:t>
-            </w:r>
+              <w:t>Por otro lado, la principal dificultad técnica residió en el proceso de búsqueda y ajuste de hiperparámetros de los modelos predictivos para estimar la demanda operacional en las zonas abarcadas mediante los datos históricos. El mayor reto consistió en calibrar los parámetros necesarios para lograr un resultado aceptable refiriéndonos a la precisión, que tuviera un porcentaje de confianza elevado y proyectara comportamientos realistas sin caer en sobreajuste. Para solventar esta dificultad, se aisló un conjunto de datos de validación independiente (generate_validation_dataset.py) para evaluar rigurosamente las métricas de rendimiento (R2 y RMSE); además, se completó la migración del módulo de Emergencia y Operación a una base de datos PostgreSQL 16 real mediante SQLAlchemy y migraciones con Alembic, reemplazando la gestión en memoria usada al inicio de la Fase 2. Asimismo, para evitar brechas de seguridad con claves secretas, se utilizó el archivo .env.example como plantilla de configuración estandarizada, manteniendo las credenciales reales resguardadas exclusivamente en entornos locales mediante el archivo .</w:t>
+            </w:r>
+            <w:proofErr w:type="spellStart"/>
             <w:r>
               <w:rPr>
                 <w:rFonts w:ascii="Calibri" w:hAnsi="Calibri"/>
                 <w:lang w:val="es-MX"/>
               </w:rPr>
-              <w:t>zonas abarcadas mediante los datos historicos</w:t>
-            </w:r>
+              <w:t>env</w:t>
+            </w:r>
+            <w:proofErr w:type="spellEnd"/>
             <w:r>
               <w:rPr>
                 <w:rFonts w:ascii="Calibri" w:hAnsi="Calibri"/>
                 <w:lang w:val="es-MX"/>
               </w:rPr>
-              <w:t xml:space="preserve">. El mayor reto consistió en calibrar los parámetros necesarios para lograr un resultado </w:t>
-            </w:r>
-            <w:r>
-              <w:rPr>
-                <w:rFonts w:ascii="Calibri" w:hAnsi="Calibri"/>
-                <w:lang w:val="es-MX"/>
-              </w:rPr>
-              <w:t>aceptable refiriéndonos a</w:t>
-            </w:r>
-            <w:r>
-              <w:rPr>
-                <w:rFonts w:ascii="Calibri" w:hAnsi="Calibri"/>
-                <w:lang w:val="es-MX"/>
-              </w:rPr>
-              <w:t xml:space="preserve"> </w:t>
-            </w:r>
-            <w:r>
-              <w:rPr>
-                <w:rFonts w:ascii="Calibri" w:hAnsi="Calibri"/>
-                <w:lang w:val="es-MX"/>
-              </w:rPr>
-              <w:t>la</w:t>
-            </w:r>
-            <w:r>
-              <w:rPr>
-                <w:rFonts w:ascii="Calibri" w:hAnsi="Calibri"/>
-                <w:lang w:val="es-MX"/>
-              </w:rPr>
-              <w:t xml:space="preserve"> precisión, que </w:t>
-            </w:r>
-            <w:r>
-              <w:rPr>
-                <w:rFonts w:ascii="Calibri" w:hAnsi="Calibri"/>
-                <w:lang w:val="es-MX"/>
-              </w:rPr>
-              <w:t>tuviera un porcentaje de confianza elevado</w:t>
-            </w:r>
-            <w:r>
-              <w:rPr>
-                <w:rFonts w:ascii="Calibri" w:hAnsi="Calibri"/>
-                <w:lang w:val="es-MX"/>
-              </w:rPr>
-              <w:t xml:space="preserve"> y proyectara comportamientos realistas sin caer en sobreajuste. Para solventar esta dificultad, se </w:t>
-            </w:r>
-            <w:r>
-              <w:rPr>
-                <w:rFonts w:ascii="Calibri" w:hAnsi="Calibri"/>
-                <w:lang w:val="es-MX"/>
-              </w:rPr>
-              <w:t>aislará</w:t>
-            </w:r>
-            <w:r>
-              <w:rPr>
-                <w:rFonts w:ascii="Calibri" w:hAnsi="Calibri"/>
-                <w:lang w:val="es-MX"/>
-              </w:rPr>
-              <w:t xml:space="preserve"> un conjunto de datos de validación independiente (generate_validation_dataset.py) para evaluar rigurosamente las métricas de rendimiento (</w:t>
+              <w:t xml:space="preserve"> ignorado por Git.</w:t>
             </w:r>
             <m:oMath>
               <m:sSup>
@@ -3203,27 +3642,6 @@
                 </m:sup>
               </m:sSup>
             </m:oMath>
-            <w:r>
-              <w:rPr>
-                <w:rFonts w:ascii="Calibri" w:hAnsi="Calibri"/>
-                <w:lang w:val="es-MX"/>
-              </w:rPr>
-              <w:t>, RMSE)</w:t>
-            </w:r>
-            <w:r>
-              <w:rPr>
-                <w:rFonts w:ascii="Calibri" w:hAnsi="Calibri"/>
-                <w:lang w:val="es-MX"/>
-              </w:rPr>
-              <w:t xml:space="preserve">, además </w:t>
-            </w:r>
-            <w:r>
-              <w:rPr>
-                <w:rFonts w:ascii="Calibri" w:hAnsi="Calibri"/>
-                <w:lang w:val="es-MX"/>
-              </w:rPr>
-              <w:t>se implementó una máquina de estados compartida en memoria dentro del servicio ASGI (POST /state y GET /state). Asimismo, para evitar brechas de seguridad con claves secretas, se utilizó el archivo .env.example como plantilla de configuración estandarizada, manteniendo las credenciales reales resguardadas exclusivamente en entornos locales mediante el archivo .env ignorado por Git.</w:t>
-            </w:r>
           </w:p>
         </w:tc>
       </w:tr>
@@ -3258,9 +3676,6 @@
         <w:gridCol w:w="9493"/>
       </w:tblGrid>
       <w:tr>
-        <w:trPr>
-          <w:trHeight w:val="1936"/>
-        </w:trPr>
         <w:tc>
           <w:tcPr>
             <w:tcW w:w="5000" w:type="pct"/>
@@ -3309,15 +3724,16 @@
                 <w:iCs/>
                 <w:lang w:eastAsia="es-CL"/>
               </w:rPr>
-              <w:t>El plan de trabajo del proyecto Alerta360 no ha requerido la eliminación de actividades, garantizando el cumplimiento integral de los objetivos planteados en la Fase 1. Sin embargo, se realizaron dos ajustes de priorización técnica e investigación operacional: por un lado, se pospuso temporalmente la integración formal de PostgreSQL 16 para priorizar la respuesta en vivo del dashboard, gestionando el estado en memoria desde FastAPI (POST /state y GET /state) para optimizar la fluidez de las transiciones de estados radiales (6-0 a 6-9) y el cálculo de rutas (ETA); por otro lado, se ajustó el alcance del módulo de incidencias para incorporar un estudio detallado sobre los protocolos y flujos reales de respuesta institucional, asegurando que las reglas de negocio del sistema se adapten con fidelidad a las operativas de despacho de emergencias</w:t>
-            </w:r>
-            <w:r>
-              <w:rPr>
-                <w:rFonts w:ascii="Calibri" w:hAnsi="Calibri" w:cs="Arial"/>
-                <w:iCs/>
-                <w:lang w:eastAsia="es-CL"/>
-              </w:rPr>
-              <w:t>, finalmente se agrego un aparatado de reportes/ticket para dar soporte a diferentes problemas y obtener un feedback del uso actual de la página.</w:t>
+              <w:t xml:space="preserve">El plan de trabajo del proyecto Alerta360 no ha requerido la eliminación de actividades, garantizando el cumplimiento integral de los objetivos planteados en la Fase 1. Sin embargo, se realizaron dos ajustes de priorización técnica e investigación operacional: por un lado, se completó la integración formal de PostgreSQL 16 para el módulo de Emergencia y Operación (emergencias y asignaciones), mediante SQLAlchemy y migraciones con Alembic, reemplazando la gestión de estado en memoria usada al inicio </w:t>
+            </w:r>
+            <w:r>
+              <w:rPr>
+                <w:rFonts w:ascii="Calibri" w:hAnsi="Calibri" w:cs="Arial"/>
+                <w:iCs/>
+                <w:lang w:eastAsia="es-CL"/>
+              </w:rPr>
+              <w:lastRenderedPageBreak/>
+              <w:t>de la Fase 2; por otro lado, se ajustó el alcance del módulo de incidencias para incorporar un estudio detallado sobre los protocolos y flujos reales de respuesta institucional, asegurando que las reglas de negocio del sistema se adapten con fidelidad a las operativas de despacho de emergencias, finalmente se agregó un apartado de reportes/ticket para dar soporte a diferentes problemas y obtener un feedback del uso actual de la página.</w:t>
             </w:r>
           </w:p>
         </w:tc>
@@ -3370,9 +3786,6 @@
         <w:gridCol w:w="9498"/>
       </w:tblGrid>
       <w:tr>
-        <w:trPr>
-          <w:trHeight w:val="1966"/>
-        </w:trPr>
         <w:tc>
           <w:tcPr>
             <w:tcW w:w="5000" w:type="pct"/>
@@ -3393,7 +3806,6 @@
                 <w:bCs/>
                 <w:lang w:val="es-MX"/>
               </w:rPr>
-              <w:lastRenderedPageBreak/>
               <w:t>Actividades que no has iniciado o están retrasadas:</w:t>
             </w:r>
           </w:p>
@@ -3434,7 +3846,25 @@
                 <w:iCs/>
                 <w:lang w:val="es-MX" w:eastAsia="es-CL"/>
               </w:rPr>
-              <w:t xml:space="preserve">Integración y migración a la base de datos relacional definitiva (PostgreSQL 16): La implementación formal del esquema persistente se encuentra pendiente de acoplamiento final, habiéndose priorizado de forma temporal la gestión de estado en memoria mediante los endpoints de FastAPI (POST /state y GET /state) para validar la fluidez del dashboard operacional y los algoritmos de recomendación en tiempo real. </w:t>
+              <w:t>Automatización de la suite de pruebas (</w:t>
+            </w:r>
+            <w:proofErr w:type="spellStart"/>
+            <w:r>
+              <w:rPr>
+                <w:rFonts w:ascii="Calibri" w:hAnsi="Calibri" w:cs="Arial"/>
+                <w:iCs/>
+                <w:lang w:val="es-MX" w:eastAsia="es-CL"/>
+              </w:rPr>
+              <w:t>pytest</w:t>
+            </w:r>
+            <w:proofErr w:type="spellEnd"/>
+            <w:r>
+              <w:rPr>
+                <w:rFonts w:ascii="Calibri" w:hAnsi="Calibri" w:cs="Arial"/>
+                <w:iCs/>
+                <w:lang w:val="es-MX" w:eastAsia="es-CL"/>
+              </w:rPr>
+              <w:t>): La suite de pruebas automatizadas sigue reprogramada para el acoplamiento final del frontend y la consolidación de los protocolos reales de despacho; hasta ahora la validación se realiza de forma manual mediante Swagger UI y scripts de evaluación en Python.</w:t>
             </w:r>
           </w:p>
           <w:p>
@@ -3492,17 +3922,25 @@
                 <w:iCs/>
                 <w:lang w:val="es-MX" w:eastAsia="es-CL"/>
               </w:rPr>
-              <w:t>Estrategia de mitigación: Estas actividades no comprometen el avance general del proyecto APT, ya que corresponden a una secuencia lógica planificada. Mientras se concreta el levantamiento de procesos operacionales reales, el sistema opera con el catálogo de claves estándar (10-X) y códigos radiales (6-0 a 6-9). Una vez consolidados estos requerimientos de dominio y finalizada la maquetación en React, se procederá con la migración a PostgreSQL y la automatización de la suite de pruebas unitarias (pytest).</w:t>
-            </w:r>
-            <w:r>
-              <w:rPr>
-                <w:rFonts w:ascii="Calibri" w:hAnsi="Calibri" w:cs="Arial"/>
-                <w:i/>
-                <w:sz w:val="20"/>
-                <w:szCs w:val="20"/>
+              <w:t>Estrategia de mitigación: Estas actividades no comprometen el avance general del proyecto APT, ya que corresponden a una secuencia lógica planificada. Mientras se concreta el levantamiento de procesos operacionales reales, el sistema opera con el catálogo de claves estándar (10-X) y códigos radiales (6-0 a 6-9). Una vez consolidados estos requerimientos de dominio y finalizada la maquetación en React, se procederá con la automatización de la suite de pruebas unitarias (</w:t>
+            </w:r>
+            <w:proofErr w:type="spellStart"/>
+            <w:r>
+              <w:rPr>
+                <w:rFonts w:ascii="Calibri" w:hAnsi="Calibri" w:cs="Arial"/>
+                <w:iCs/>
                 <w:lang w:val="es-MX" w:eastAsia="es-CL"/>
               </w:rPr>
-              <w:t xml:space="preserve"> </w:t>
+              <w:t>pytest</w:t>
+            </w:r>
+            <w:proofErr w:type="spellEnd"/>
+            <w:r>
+              <w:rPr>
+                <w:rFonts w:ascii="Calibri" w:hAnsi="Calibri" w:cs="Arial"/>
+                <w:iCs/>
+                <w:lang w:val="es-MX" w:eastAsia="es-CL"/>
+              </w:rPr>
+              <w:t xml:space="preserve">). </w:t>
             </w:r>
           </w:p>
         </w:tc>

</xml_diff>